<commit_message>
Owner answers on MoA and deep review; legal drafts updated for no-wallet decision (30 Oct 2026)
Co-Authored-By: Claude Opus 5.5 <noreply@anthropic.com>
Claude-Session: https://claude.ai/code/session_01Bpzt23dnJQRXixhCLMoUgQ
</commit_message>
<xml_diff>
--- a/docs/legal/NexaTute_Website_Legal_Pages_Draft.docx
+++ b/docs/legal/NexaTute_Website_Legal_Pages_Draft.docx
@@ -416,6 +416,44 @@
           <w:rFonts w:ascii="Aptos" w:cs="Aptos" w:eastAsia="Aptos" w:hAnsi="Aptos"/>
         </w:rPr>
         <w:t xml:space="preserve">Cover Note: NexaTute Website Legal Pages</w:t>
+      </w:r>
+    </w:p>
+    <w:p>
+      <w:pPr>
+        <w:pBdr>
+          <w:left w:val="single" w:color="17365D" w:sz="24" w:space="8"/>
+        </w:pBdr>
+        <w:shd w:fill="EEF2F8" w:color="auto" w:val="clear"/>
+        <w:spacing w:after="160" w:before="120" w:line="276"/>
+        <w:ind w:left="200" w:right="120"/>
+      </w:pPr>
+      <w:r>
+        <w:rPr>
+          <w:rFonts w:ascii="Aptos" w:cs="Aptos" w:eastAsia="Aptos" w:hAnsi="Aptos"/>
+          <w:b/>
+          <w:bCs/>
+        </w:rPr>
+        <w:t xml:space="preserve">Owner decision, 30 October 2026:</w:t>
+      </w:r>
+      <w:r>
+        <w:rPr>
+          <w:rFonts w:ascii="Aptos" w:cs="Aptos" w:eastAsia="Aptos" w:hAnsi="Aptos"/>
+        </w:rPr>
+        <w:t xml:space="preserve"> the company will NOT hold customers' money as a stored balance or wallet. Use </w:t>
+      </w:r>
+      <w:r>
+        <w:rPr>
+          <w:rFonts w:ascii="Aptos" w:cs="Aptos" w:eastAsia="Aptos" w:hAnsi="Aptos"/>
+          <w:b/>
+          <w:bCs/>
+        </w:rPr>
+        <w:t xml:space="preserve">Option B</w:t>
+      </w:r>
+      <w:r>
+        <w:rPr>
+          <w:rFonts w:ascii="Aptos" w:cs="Aptos" w:eastAsia="Aptos" w:hAnsi="Aptos"/>
+        </w:rPr>
+        <w:t xml:space="preserve"> (pay per order / per plan, no stored balance) wherever two options are given; Option A is kept only for the lawyer's reference. Customer disputes: AI support first, then email to a person who decides — aligned between NexaTute and Remon Motion Studio.</w:t>
       </w:r>
     </w:p>
     <w:p>

</xml_diff>